<commit_message>
lock acquire takes too much time
</commit_message>
<xml_diff>
--- a/BP_nodes/新建 Microsoft Word 文档.docx
+++ b/BP_nodes/新建 Microsoft Word 文档.docx
@@ -590,10 +590,10 @@
           <w:noProof/>
         </w:rPr>
         <w:drawing>
-          <wp:inline distT="0" distB="0" distL="0" distR="0" wp14:anchorId="25460A3F" wp14:editId="2E198A36">
-            <wp:extent cx="6552381" cy="1161905"/>
-            <wp:effectExtent l="0" t="0" r="1270" b="635"/>
-            <wp:docPr id="311765715" name="图片 1" descr="文本&#10;&#10;AI 生成的内容可能不正确。"/>
+          <wp:inline distT="0" distB="0" distL="0" distR="0" wp14:anchorId="5B8DDC18" wp14:editId="223D0C7A">
+            <wp:extent cx="6304762" cy="1209524"/>
+            <wp:effectExtent l="0" t="0" r="1270" b="0"/>
+            <wp:docPr id="933349461" name="图片 1" descr="文本&#10;&#10;AI 生成的内容可能不正确。"/>
             <wp:cNvGraphicFramePr>
               <a:graphicFrameLocks xmlns:a="http://schemas.openxmlformats.org/drawingml/2006/main" noChangeAspect="1"/>
             </wp:cNvGraphicFramePr>
@@ -601,7 +601,7 @@
               <a:graphicData uri="http://schemas.openxmlformats.org/drawingml/2006/picture">
                 <pic:pic xmlns:pic="http://schemas.openxmlformats.org/drawingml/2006/picture">
                   <pic:nvPicPr>
-                    <pic:cNvPr id="311765715" name="图片 1" descr="文本&#10;&#10;AI 生成的内容可能不正确。"/>
+                    <pic:cNvPr id="933349461" name="图片 1" descr="文本&#10;&#10;AI 生成的内容可能不正确。"/>
                     <pic:cNvPicPr/>
                   </pic:nvPicPr>
                   <pic:blipFill>
@@ -613,7 +613,7 @@
                   <pic:spPr>
                     <a:xfrm>
                       <a:off x="0" y="0"/>
-                      <a:ext cx="6552381" cy="1161905"/>
+                      <a:ext cx="6304762" cy="1209524"/>
                     </a:xfrm>
                     <a:prstGeom prst="rect">
                       <a:avLst/>
@@ -629,10 +629,73 @@
     <w:p/>
     <w:p>
       <w:pPr>
+        <w:widowControl/>
         <w:rPr>
           <w:rFonts w:hint="eastAsia"/>
         </w:rPr>
       </w:pPr>
+      <w:r>
+        <w:rPr>
+          <w:rFonts w:hint="eastAsia"/>
+        </w:rPr>
+        <w:br w:type="page"/>
+      </w:r>
+    </w:p>
+    <w:p/>
+    <w:p>
+      <w:r>
+        <w:rPr>
+          <w:noProof/>
+        </w:rPr>
+        <w:drawing>
+          <wp:inline distT="0" distB="0" distL="0" distR="0" wp14:anchorId="6CEB9C6A" wp14:editId="35678203">
+            <wp:extent cx="6645910" cy="1472565"/>
+            <wp:effectExtent l="0" t="0" r="2540" b="0"/>
+            <wp:docPr id="897556690" name="图片 1" descr="文本&#10;&#10;AI 生成的内容可能不正确。"/>
+            <wp:cNvGraphicFramePr>
+              <a:graphicFrameLocks xmlns:a="http://schemas.openxmlformats.org/drawingml/2006/main" noChangeAspect="1"/>
+            </wp:cNvGraphicFramePr>
+            <a:graphic xmlns:a="http://schemas.openxmlformats.org/drawingml/2006/main">
+              <a:graphicData uri="http://schemas.openxmlformats.org/drawingml/2006/picture">
+                <pic:pic xmlns:pic="http://schemas.openxmlformats.org/drawingml/2006/picture">
+                  <pic:nvPicPr>
+                    <pic:cNvPr id="897556690" name="图片 1" descr="文本&#10;&#10;AI 生成的内容可能不正确。"/>
+                    <pic:cNvPicPr/>
+                  </pic:nvPicPr>
+                  <pic:blipFill>
+                    <a:blip r:embed="rId15"/>
+                    <a:stretch>
+                      <a:fillRect/>
+                    </a:stretch>
+                  </pic:blipFill>
+                  <pic:spPr>
+                    <a:xfrm>
+                      <a:off x="0" y="0"/>
+                      <a:ext cx="6645910" cy="1472565"/>
+                    </a:xfrm>
+                    <a:prstGeom prst="rect">
+                      <a:avLst/>
+                    </a:prstGeom>
+                  </pic:spPr>
+                </pic:pic>
+              </a:graphicData>
+            </a:graphic>
+          </wp:inline>
+        </w:drawing>
+      </w:r>
+    </w:p>
+    <w:p>
+      <w:pPr>
+        <w:rPr>
+          <w:rFonts w:hint="eastAsia"/>
+        </w:rPr>
+      </w:pPr>
+      <w:r>
+        <w:rPr>
+          <w:rFonts w:hint="eastAsia"/>
+        </w:rPr>
+        <w:t xml:space="preserve"> </w:t>
+      </w:r>
     </w:p>
     <w:sectPr>
       <w:pgSz w:w="11906" w:h="16838"/>

</xml_diff>